<commit_message>
Add new process documentation templates and enhance quality self-check logic. Introduce functions for filling inspection lot project names and distributing values within specified ranges. Update tests to validate new functionality and ensure accurate document generation.
</commit_message>
<xml_diff>
--- a/public/templates/process-docs/开工报审.docx
+++ b/public/templates/process-docs/开工报审.docx
@@ -7,8 +7,8 @@
         <w:pStyle w:val="2"/>
         <w:pageBreakBefore/>
       </w:pPr>
-      <w:bookmarkStart w:id="0" w:name="_Toc390359054"/>
-      <w:bookmarkStart w:id="1" w:name="_Toc395081782"/>
+      <w:bookmarkStart w:id="0" w:name="_Toc395081782"/>
+      <w:bookmarkStart w:id="1" w:name="_Toc390359054"/>
       <w:r>
         <w:rPr>
           <w:rFonts w:hint="eastAsia"/>
@@ -30,23 +30,6 @@
         <w:spacing w:line="360" w:lineRule="exact"/>
         <w:jc w:val="left"/>
         <w:rPr>
-          <w:rFonts w:hint="eastAsia" w:ascii="宋体" w:hAnsi="宋体"/>
-          <w:b/>
-        </w:rPr>
-      </w:pPr>
-      <w:r>
-        <w:rPr>
-          <w:rFonts w:hint="eastAsia" w:ascii="宋体" w:hAnsi="宋体"/>
-          <w:b/>
-        </w:rPr>
-        <w:t xml:space="preserve">工程名称：中核汇能高明创楷3.58904MWp分布式光伏项目 </w:t>
-      </w:r>
-    </w:p>
-    <w:p>
-      <w:pPr>
-        <w:spacing w:line="360" w:lineRule="exact"/>
-        <w:jc w:val="right"/>
-        <w:rPr>
           <w:rFonts w:ascii="宋体" w:hAnsi="宋体"/>
           <w:b/>
         </w:rPr>
@@ -56,7 +39,7 @@
           <w:rFonts w:hint="eastAsia" w:ascii="宋体" w:hAnsi="宋体"/>
           <w:b/>
         </w:rPr>
-        <w:t>编号：5028G01-</w:t>
+        <w:t>工程名称：中核汇能高明创楷3.58904MWp分布式光伏项目 编号：5028G01-</w:t>
       </w:r>
       <w:r>
         <w:rPr>
@@ -64,25 +47,17 @@
           <w:b/>
           <w:lang w:val="en-US" w:eastAsia="zh-CN"/>
         </w:rPr>
-        <w:t>SG-ZHHC-KG</w:t>
+        <w:t>SG-ZHHC-KG-01</w:t>
+      </w:r>
+      <w:r>
+        <w:rPr>
+          <w:rFonts w:hint="eastAsia" w:ascii="宋体" w:hAnsi="宋体"/>
+          <w:b/>
+        </w:rPr>
+        <w:t xml:space="preserve"> </w:t>
       </w:r>
       <w:bookmarkStart w:id="2" w:name="_GoBack"/>
       <w:bookmarkEnd w:id="2"/>
-      <w:r>
-        <w:rPr>
-          <w:rFonts w:hint="eastAsia" w:ascii="宋体" w:hAnsi="宋体"/>
-          <w:b/>
-          <w:lang w:val="en-US" w:eastAsia="zh-CN"/>
-        </w:rPr>
-        <w:t>-01</w:t>
-      </w:r>
-      <w:r>
-        <w:rPr>
-          <w:rFonts w:hint="eastAsia" w:ascii="宋体" w:hAnsi="宋体"/>
-          <w:b/>
-        </w:rPr>
-        <w:t xml:space="preserve"> </w:t>
-      </w:r>
     </w:p>
     <w:tbl>
       <w:tblPr>
@@ -109,22 +84,6 @@
         <w:gridCol w:w="9556"/>
       </w:tblGrid>
       <w:tr>
-        <w:tblPrEx>
-          <w:tblBorders>
-            <w:top w:val="single" w:color="auto" w:sz="12" w:space="0"/>
-            <w:left w:val="single" w:color="auto" w:sz="12" w:space="0"/>
-            <w:bottom w:val="single" w:color="auto" w:sz="12" w:space="0"/>
-            <w:right w:val="single" w:color="auto" w:sz="12" w:space="0"/>
-            <w:insideH w:val="single" w:color="auto" w:sz="6" w:space="0"/>
-            <w:insideV w:val="single" w:color="auto" w:sz="6" w:space="0"/>
-          </w:tblBorders>
-          <w:tblCellMar>
-            <w:top w:w="0" w:type="dxa"/>
-            <w:left w:w="108" w:type="dxa"/>
-            <w:bottom w:w="0" w:type="dxa"/>
-            <w:right w:w="108" w:type="dxa"/>
-          </w:tblCellMar>
-        </w:tblPrEx>
         <w:trPr>
           <w:cantSplit/>
           <w:trHeight w:val="6266" w:hRule="atLeast"/>
@@ -599,22 +558,6 @@
         </w:tc>
       </w:tr>
       <w:tr>
-        <w:tblPrEx>
-          <w:tblBorders>
-            <w:top w:val="single" w:color="auto" w:sz="12" w:space="0"/>
-            <w:left w:val="single" w:color="auto" w:sz="12" w:space="0"/>
-            <w:bottom w:val="single" w:color="auto" w:sz="12" w:space="0"/>
-            <w:right w:val="single" w:color="auto" w:sz="12" w:space="0"/>
-            <w:insideH w:val="single" w:color="auto" w:sz="6" w:space="0"/>
-            <w:insideV w:val="single" w:color="auto" w:sz="6" w:space="0"/>
-          </w:tblBorders>
-          <w:tblCellMar>
-            <w:top w:w="0" w:type="dxa"/>
-            <w:left w:w="108" w:type="dxa"/>
-            <w:bottom w:w="0" w:type="dxa"/>
-            <w:right w:w="108" w:type="dxa"/>
-          </w:tblCellMar>
-        </w:tblPrEx>
         <w:trPr>
           <w:cantSplit/>
           <w:trHeight w:val="2336" w:hRule="atLeast"/>
@@ -743,22 +686,6 @@
         </w:tc>
       </w:tr>
       <w:tr>
-        <w:tblPrEx>
-          <w:tblBorders>
-            <w:top w:val="single" w:color="auto" w:sz="12" w:space="0"/>
-            <w:left w:val="single" w:color="auto" w:sz="12" w:space="0"/>
-            <w:bottom w:val="single" w:color="auto" w:sz="12" w:space="0"/>
-            <w:right w:val="single" w:color="auto" w:sz="12" w:space="0"/>
-            <w:insideH w:val="single" w:color="auto" w:sz="6" w:space="0"/>
-            <w:insideV w:val="single" w:color="auto" w:sz="6" w:space="0"/>
-          </w:tblBorders>
-          <w:tblCellMar>
-            <w:top w:w="0" w:type="dxa"/>
-            <w:left w:w="108" w:type="dxa"/>
-            <w:bottom w:w="0" w:type="dxa"/>
-            <w:right w:w="108" w:type="dxa"/>
-          </w:tblCellMar>
-        </w:tblPrEx>
         <w:trPr>
           <w:cantSplit/>
           <w:trHeight w:val="3243" w:hRule="atLeast"/>

</xml_diff>